<commit_message>
Piloto B2B: rutina diaria (mensaje de 3 lineas a las 6 PM, respuesta en 24 h, llamada de 15 min los viernes)
</commit_message>
<xml_diff>
--- a/recursos/comercial/B2B/PILOTO_B2B_TABLERO_METRICAS.docx
+++ b/recursos/comercial/B2B/PILOTO_B2B_TABLERO_METRICAS.docx
@@ -643,6 +643,55 @@
           <w:color w:val="E54C09"/>
           <w:sz w:val="24"/>
         </w:rPr>
+        <w:t>3-BIS. La rutina diaria (sin reunión)</w:t>
+      </w:r>
+    </w:p>
+    <w:p>
+      <w:pPr>
+        <w:spacing w:after="40"/>
+      </w:pPr>
+      <w:r>
+        <w:rPr>
+          <w:b w:val="0"/>
+          <w:sz w:val="20"/>
+        </w:rPr>
+        <w:t>Todos los días hábiles, a las 6 PM (o antes de su clase de la noche), él manda a gerencia UN mensaje de tres líneas:</w:t>
+      </w:r>
+    </w:p>
+    <w:p>
+      <w:pPr>
+        <w:spacing w:after="60"/>
+      </w:pPr>
+      <w:r>
+        <w:rPr>
+          <w:b/>
+          <w:sz w:val="20"/>
+        </w:rPr>
+        <w:t>"Hoy: contacté [N] empresas ([nombres]). Reuniones: [N] ([empresa, día y hora]). Convenios / agendados con gerencia: [N]. · Mañana: [qué va a hacer, con nombres]. · Necesito de ti: [nada / una cosa concreta]."</w:t>
+      </w:r>
+    </w:p>
+    <w:p>
+      <w:pPr>
+        <w:spacing w:after="80"/>
+      </w:pPr>
+      <w:r>
+        <w:rPr>
+          <w:b w:val="0"/>
+          <w:sz w:val="20"/>
+        </w:rPr>
+        <w:t>Gerencia lo lee en dos minutos, responde una línea y resuelve lo pedido en menos de 24 horas. Si un día no llega el mensaje, se pide. Si pasan tres días sin un contacto nuevo, se habla ese mismo día. El tracker se actualiza a diario; el viernes hay una llamada de 15 minutos con el tracker en pantalla para revisar la semana y ajustar el guion.</w:t>
+      </w:r>
+    </w:p>
+    <w:p>
+      <w:pPr>
+        <w:spacing w:before="160" w:after="60"/>
+      </w:pPr>
+      <w:r>
+        <w:rPr>
+          <w:b/>
+          <w:color w:val="E54C09"/>
+          <w:sz w:val="24"/>
+        </w:rPr>
         <w:t>4. Los dos cortes</w:t>
       </w:r>
     </w:p>

</xml_diff>

<commit_message>
Piloto B2B: cortes cada 15 dias (15/30/45/60) con acumulado minimo y decision por corte; sin convenio al dia 30 se cierra; propuesta, tablero, tracker y otrosi
Co-Authored-By: Claude Fable 5.1 <noreply@anthropic.com>
</commit_message>
<xml_diff>
--- a/recursos/comercial/B2B/PILOTO_B2B_TABLERO_METRICAS.docx
+++ b/recursos/comercial/B2B/PILOTO_B2B_TABLERO_METRICAS.docx
@@ -12,7 +12,7 @@
           <w:color w:val="E54C09"/>
           <w:sz w:val="28"/>
         </w:rPr>
-        <w:t>PILOTO DE ALIANZAS EMPRESARIALES — TABLERO DE MÉTRICAS (60 DÍAS)</w:t>
+        <w:t>PILOTO DE ALIANZAS EMPRESARIALES — TABLERO DE MÉTRICAS (60 DÍAS, CORTES CADA 15)</w:t>
       </w:r>
     </w:p>
     <w:p>
@@ -262,7 +262,7 @@
               <w:rPr>
                 <w:sz w:val="18"/>
               </w:rPr>
-              <w:t>10 (mínimo) · 20 (bueno)</w:t>
+              <w:t>24 (6 · 12 · 18 · 24 por corte)</w:t>
             </w:r>
           </w:p>
         </w:tc>
@@ -329,7 +329,7 @@
               <w:rPr>
                 <w:sz w:val="18"/>
               </w:rPr>
-              <w:t>5 (mínimo) · 10 (bueno)</w:t>
+              <w:t>10 (2 · 5 · 8 · 10 por corte)</w:t>
             </w:r>
           </w:p>
         </w:tc>
@@ -396,7 +396,7 @@
               <w:rPr>
                 <w:sz w:val="18"/>
               </w:rPr>
-              <w:t>3 (mínimo) · 5 (bueno)</w:t>
+              <w:t>3 (1 al día 30 · 2 al 45 · 3 al 60)</w:t>
             </w:r>
           </w:p>
         </w:tc>
@@ -692,7 +692,7 @@
           <w:color w:val="E54C09"/>
           <w:sz w:val="24"/>
         </w:rPr>
-        <w:t>4. Los dos cortes</w:t>
+        <w:t>4. Los cuatro cortes (acumulado mínimo)</w:t>
       </w:r>
     </w:p>
     <w:tbl>
@@ -710,7 +710,7 @@
       <w:tr>
         <w:tc>
           <w:tcPr>
-            <w:tcW w:type="dxa" w:w="907"/>
+            <w:tcW w:type="dxa" w:w="794"/>
             <w:shd w:val="clear" w:color="auto" w:fill="FFF8E7"/>
           </w:tcPr>
           <w:p>
@@ -728,7 +728,7 @@
         </w:tc>
         <w:tc>
           <w:tcPr>
-            <w:tcW w:type="dxa" w:w="3402"/>
+            <w:tcW w:type="dxa" w:w="3175"/>
             <w:shd w:val="clear" w:color="auto" w:fill="FFF8E7"/>
           </w:tcPr>
           <w:p>
@@ -740,13 +740,13 @@
                 <w:b/>
                 <w:sz w:val="18"/>
               </w:rPr>
-              <w:t>Qué se mira</w:t>
+              <w:t>Mínimo acumulado</w:t>
             </w:r>
           </w:p>
         </w:tc>
         <w:tc>
           <w:tcPr>
-            <w:tcW w:type="dxa" w:w="2778"/>
+            <w:tcW w:type="dxa" w:w="2494"/>
             <w:shd w:val="clear" w:color="auto" w:fill="FFF8E7"/>
           </w:tcPr>
           <w:p>
@@ -764,7 +764,7 @@
         </w:tc>
         <w:tc>
           <w:tcPr>
-            <w:tcW w:type="dxa" w:w="2721"/>
+            <w:tcW w:type="dxa" w:w="3345"/>
             <w:shd w:val="clear" w:color="auto" w:fill="FFF8E7"/>
           </w:tcPr>
           <w:p>
@@ -784,7 +784,74 @@
       <w:tr>
         <w:tc>
           <w:tcPr>
-            <w:tcW w:type="dxa" w:w="907"/>
+            <w:tcW w:type="dxa" w:w="794"/>
+          </w:tcPr>
+          <w:p>
+            <w:pPr>
+              <w:spacing w:after="0"/>
+            </w:pPr>
+            <w:r>
+              <w:rPr>
+                <w:b/>
+                <w:sz w:val="18"/>
+              </w:rPr>
+              <w:t>Día 15</w:t>
+            </w:r>
+          </w:p>
+        </w:tc>
+        <w:tc>
+          <w:tcPr>
+            <w:tcW w:type="dxa" w:w="3175"/>
+          </w:tcPr>
+          <w:p>
+            <w:pPr>
+              <w:spacing w:after="0"/>
+            </w:pPr>
+            <w:r>
+              <w:rPr>
+                <w:sz w:val="18"/>
+              </w:rPr>
+              <w:t>6 contactadas · 2 reuniones · tracker al día.</w:t>
+            </w:r>
+          </w:p>
+        </w:tc>
+        <w:tc>
+          <w:tcPr>
+            <w:tcW w:type="dxa" w:w="2494"/>
+          </w:tcPr>
+          <w:p>
+            <w:pPr>
+              <w:spacing w:after="0"/>
+            </w:pPr>
+            <w:r>
+              <w:rPr>
+                <w:sz w:val="18"/>
+              </w:rPr>
+              <w:t>Sigue igual.</w:t>
+            </w:r>
+          </w:p>
+        </w:tc>
+        <w:tc>
+          <w:tcPr>
+            <w:tcW w:type="dxa" w:w="3345"/>
+          </w:tcPr>
+          <w:p>
+            <w:pPr>
+              <w:spacing w:after="0"/>
+            </w:pPr>
+            <w:r>
+              <w:rPr>
+                <w:sz w:val="18"/>
+              </w:rPr>
+              <w:t>Sin 2 reuniones = falla la puerta o el discurso: role-play correctivo con gerencia esa semana y lista nueva de empresas.</w:t>
+            </w:r>
+          </w:p>
+        </w:tc>
+      </w:tr>
+      <w:tr>
+        <w:tc>
+          <w:tcPr>
+            <w:tcW w:type="dxa" w:w="794"/>
           </w:tcPr>
           <w:p>
             <w:pPr>
@@ -801,7 +868,7 @@
         </w:tc>
         <w:tc>
           <w:tcPr>
-            <w:tcW w:type="dxa" w:w="3402"/>
+            <w:tcW w:type="dxa" w:w="3175"/>
           </w:tcPr>
           <w:p>
             <w:pPr>
@@ -811,13 +878,13 @@
               <w:rPr>
                 <w:sz w:val="18"/>
               </w:rPr>
-              <w:t>Actividad: contactadas y reuniones. Resultado mínimo: 1 convenio firmado o 3 reuniones con decisor.</w:t>
+              <w:t>12 contactadas · 5 reuniones · 1 convenio firmado.</w:t>
             </w:r>
           </w:p>
         </w:tc>
         <w:tc>
           <w:tcPr>
-            <w:tcW w:type="dxa" w:w="2778"/>
+            <w:tcW w:type="dxa" w:w="2494"/>
           </w:tcPr>
           <w:p>
             <w:pPr>
@@ -827,13 +894,13 @@
               <w:rPr>
                 <w:sz w:val="18"/>
               </w:rPr>
-              <w:t>Sigue; se ajusta el guion con lo que aprendió.</w:t>
+              <w:t>Sigue; se afina el cierre con lo que aprendió.</w:t>
             </w:r>
           </w:p>
         </w:tc>
         <w:tc>
           <w:tcPr>
-            <w:tcW w:type="dxa" w:w="2721"/>
+            <w:tcW w:type="dxa" w:w="3345"/>
           </w:tcPr>
           <w:p>
             <w:pPr>
@@ -843,7 +910,7 @@
               <w:rPr>
                 <w:sz w:val="18"/>
               </w:rPr>
-              <w:t>Se revisa juntos qué está fallando (puerta, discurso, público). Una semana más de prueba con el ajuste; si tampoco, se cierra el piloto sin drama.</w:t>
+              <w:t>Sin convenio firmado, el piloto se cierra. El material y los contactos quedan en la academia (contrato con IP).</w:t>
             </w:r>
           </w:p>
         </w:tc>
@@ -851,7 +918,74 @@
       <w:tr>
         <w:tc>
           <w:tcPr>
-            <w:tcW w:type="dxa" w:w="907"/>
+            <w:tcW w:type="dxa" w:w="794"/>
+          </w:tcPr>
+          <w:p>
+            <w:pPr>
+              <w:spacing w:after="0"/>
+            </w:pPr>
+            <w:r>
+              <w:rPr>
+                <w:b/>
+                <w:sz w:val="18"/>
+              </w:rPr>
+              <w:t>Día 45</w:t>
+            </w:r>
+          </w:p>
+        </w:tc>
+        <w:tc>
+          <w:tcPr>
+            <w:tcW w:type="dxa" w:w="3175"/>
+          </w:tcPr>
+          <w:p>
+            <w:pPr>
+              <w:spacing w:after="0"/>
+            </w:pPr>
+            <w:r>
+              <w:rPr>
+                <w:sz w:val="18"/>
+              </w:rPr>
+              <w:t>18 contactadas · 8 reuniones · 2 convenios · 1 plan empresa cerrado o agendado · 3 leads con nombre de empresa · 1 matrícula.</w:t>
+            </w:r>
+          </w:p>
+        </w:tc>
+        <w:tc>
+          <w:tcPr>
+            <w:tcW w:type="dxa" w:w="2494"/>
+          </w:tcPr>
+          <w:p>
+            <w:pPr>
+              <w:spacing w:after="0"/>
+            </w:pPr>
+            <w:r>
+              <w:rPr>
+                <w:sz w:val="18"/>
+              </w:rPr>
+              <w:t>Sigue.</w:t>
+            </w:r>
+          </w:p>
+        </w:tc>
+        <w:tc>
+          <w:tcPr>
+            <w:tcW w:type="dxa" w:w="3345"/>
+          </w:tcPr>
+          <w:p>
+            <w:pPr>
+              <w:spacing w:after="0"/>
+            </w:pPr>
+            <w:r>
+              <w:rPr>
+                <w:sz w:val="18"/>
+              </w:rPr>
+              <w:t>Convenios sin leads = la empresa no difundió: visita de 20 min con el diagnóstico de inglés al equipo. Sin segundo convenio, se revisa si se cierra.</w:t>
+            </w:r>
+          </w:p>
+        </w:tc>
+      </w:tr>
+      <w:tr>
+        <w:tc>
+          <w:tcPr>
+            <w:tcW w:type="dxa" w:w="794"/>
           </w:tcPr>
           <w:p>
             <w:pPr>
@@ -868,7 +1002,7 @@
         </w:tc>
         <w:tc>
           <w:tcPr>
-            <w:tcW w:type="dxa" w:w="3402"/>
+            <w:tcW w:type="dxa" w:w="3175"/>
           </w:tcPr>
           <w:p>
             <w:pPr>
@@ -878,13 +1012,13 @@
               <w:rPr>
                 <w:sz w:val="18"/>
               </w:rPr>
-              <w:t>Resultado: convenios firmados y matrículas por alianza.</w:t>
+              <w:t>24 contactadas · 10 reuniones · 3 convenios · 2 planes empresa · 10 leads · 3 matrículas por alianza.</w:t>
             </w:r>
           </w:p>
         </w:tc>
         <w:tc>
           <w:tcPr>
-            <w:tcW w:type="dxa" w:w="2778"/>
+            <w:tcW w:type="dxa" w:w="2494"/>
           </w:tcPr>
           <w:p>
             <w:pPr>
@@ -894,13 +1028,13 @@
               <w:rPr>
                 <w:sz w:val="18"/>
               </w:rPr>
-              <w:t>3 convenios o 3 matrículas → se formaliza el rol "docente + desarrollo comercial" con metas trimestrales y el anexo se renueva.</w:t>
+              <w:t>Se formaliza el rol "docente + desarrollo comercial" con metas trimestrales y el anexo se renueva.</w:t>
             </w:r>
           </w:p>
         </w:tc>
         <w:tc>
           <w:tcPr>
-            <w:tcW w:type="dxa" w:w="2721"/>
+            <w:tcW w:type="dxa" w:w="3345"/>
           </w:tcPr>
           <w:p>
             <w:pPr>
@@ -910,7 +1044,7 @@
               <w:rPr>
                 <w:sz w:val="18"/>
               </w:rPr>
-              <w:t>Se agradece, se documenta lo aprendido, y él sigue siendo docente. El material y los contactos quedan en la academia (contrato con IP).</w:t>
+              <w:t>Se agradece, se documenta lo aprendido, y él sigue siendo docente.</w:t>
             </w:r>
           </w:p>
         </w:tc>

</xml_diff>